<commit_message>
Lista atualizada até questão 31
</commit_message>
<xml_diff>
--- a/Lista/Pergutas/Lista 01.docx
+++ b/Lista/Pergutas/Lista 01.docx
@@ -483,6 +483,31 @@
         <w:rPr>
           <w:rFonts w:ascii="Arial" w:hAnsi="Arial" w:cs="Arial"/>
         </w:rPr>
+        <w:t>Quais</w:t>
+      </w:r>
+      <w:r>
+        <w:rPr>
+          <w:rFonts w:ascii="Arial" w:hAnsi="Arial" w:cs="Arial"/>
+        </w:rPr>
+        <w:t xml:space="preserve"> pedidos foram entregues atrasados</w:t>
+      </w:r>
+    </w:p>
+    <w:p>
+      <w:pPr>
+        <w:pStyle w:val="PargrafodaLista"/>
+        <w:numPr>
+          <w:ilvl w:val="0"/>
+          <w:numId w:val="1"/>
+        </w:numPr>
+        <w:jc w:val="both"/>
+        <w:rPr>
+          <w:rFonts w:ascii="Arial" w:hAnsi="Arial" w:cs="Arial"/>
+        </w:rPr>
+      </w:pPr>
+      <w:r>
+        <w:rPr>
+          <w:rFonts w:ascii="Arial" w:hAnsi="Arial" w:cs="Arial"/>
+        </w:rPr>
         <w:t>Quantos pedidos que foram pagos, mas ainda não enviados</w:t>
       </w:r>
     </w:p>
@@ -502,25 +527,6 @@
         <w:rPr>
           <w:rFonts w:ascii="Arial" w:hAnsi="Arial" w:cs="Arial"/>
         </w:rPr>
-        <w:t>Quantos pedidos foram entregues atrasados</w:t>
-      </w:r>
-    </w:p>
-    <w:p>
-      <w:pPr>
-        <w:pStyle w:val="PargrafodaLista"/>
-        <w:numPr>
-          <w:ilvl w:val="0"/>
-          <w:numId w:val="1"/>
-        </w:numPr>
-        <w:jc w:val="both"/>
-        <w:rPr>
-          <w:rFonts w:ascii="Arial" w:hAnsi="Arial" w:cs="Arial"/>
-        </w:rPr>
-      </w:pPr>
-      <w:r>
-        <w:rPr>
-          <w:rFonts w:ascii="Arial" w:hAnsi="Arial" w:cs="Arial"/>
-        </w:rPr>
         <w:t>Quantas venda foram feitas até o momento?</w:t>
       </w:r>
     </w:p>
@@ -571,7 +577,19 @@
         <w:rPr>
           <w:rFonts w:ascii="Arial" w:hAnsi="Arial" w:cs="Arial"/>
         </w:rPr>
-        <w:t xml:space="preserve"> de cliente mais novo?</w:t>
+        <w:t xml:space="preserve"> de cliente mais novo</w:t>
+      </w:r>
+      <w:r>
+        <w:rPr>
+          <w:rFonts w:ascii="Arial" w:hAnsi="Arial" w:cs="Arial"/>
+        </w:rPr>
+        <w:t xml:space="preserve"> e do mais velho</w:t>
+      </w:r>
+      <w:r>
+        <w:rPr>
+          <w:rFonts w:ascii="Arial" w:hAnsi="Arial" w:cs="Arial"/>
+        </w:rPr>
+        <w:t>?</w:t>
       </w:r>
     </w:p>
     <w:p>
@@ -632,6 +650,18 @@
         <w:t>E o tempo médio de cada transpor</w:t>
       </w:r>
       <w:bookmarkEnd w:id="4"/>
+      <w:r>
+        <w:rPr>
+          <w:rFonts w:ascii="Arial" w:hAnsi="Arial" w:cs="Arial"/>
+        </w:rPr>
+        <w:t>t</w:t>
+      </w:r>
+      <w:r>
+        <w:rPr>
+          <w:rFonts w:ascii="Arial" w:hAnsi="Arial" w:cs="Arial"/>
+        </w:rPr>
+        <w:t>adora</w:t>
+      </w:r>
     </w:p>
     <w:p>
       <w:pPr>
@@ -703,7 +733,28 @@
           <w:rFonts w:ascii="Arial" w:hAnsi="Arial" w:cs="Arial"/>
         </w:rPr>
       </w:pPr>
-      <w:bookmarkStart w:id="6" w:name="_Hlk199743172"/>
+      <w:bookmarkStart w:id="6" w:name="_Hlk199965370"/>
+      <w:r>
+        <w:rPr>
+          <w:rFonts w:ascii="Arial" w:hAnsi="Arial" w:cs="Arial"/>
+        </w:rPr>
+        <w:t>Liste os clientes e os produtos que ele comprou</w:t>
+      </w:r>
+      <w:bookmarkEnd w:id="6"/>
+    </w:p>
+    <w:p>
+      <w:pPr>
+        <w:pStyle w:val="PargrafodaLista"/>
+        <w:numPr>
+          <w:ilvl w:val="0"/>
+          <w:numId w:val="1"/>
+        </w:numPr>
+        <w:jc w:val="both"/>
+        <w:rPr>
+          <w:rFonts w:ascii="Arial" w:hAnsi="Arial" w:cs="Arial"/>
+        </w:rPr>
+      </w:pPr>
+      <w:bookmarkStart w:id="7" w:name="_Hlk199743172"/>
       <w:bookmarkEnd w:id="5"/>
       <w:r>
         <w:rPr>
@@ -723,7 +774,7 @@
         </w:rPr>
         <w:t xml:space="preserve"> o nome e o E-mail de todos os clientes VIP</w:t>
       </w:r>
-      <w:bookmarkEnd w:id="6"/>
+      <w:bookmarkEnd w:id="7"/>
       <w:r>
         <w:rPr>
           <w:rFonts w:ascii="Arial" w:hAnsi="Arial" w:cs="Arial"/>
@@ -743,7 +794,7 @@
           <w:rFonts w:ascii="Arial" w:hAnsi="Arial" w:cs="Arial"/>
         </w:rPr>
       </w:pPr>
-      <w:bookmarkStart w:id="7" w:name="_Hlk199744044"/>
+      <w:bookmarkStart w:id="8" w:name="_Hlk199744044"/>
       <w:r>
         <w:rPr>
           <w:rFonts w:ascii="Arial" w:hAnsi="Arial" w:cs="Arial"/>
@@ -751,7 +802,7 @@
         <w:t>Quais os clientes que só fizeram uma compra na nossa loja?</w:t>
       </w:r>
     </w:p>
-    <w:bookmarkEnd w:id="7"/>
+    <w:bookmarkEnd w:id="8"/>
     <w:p>
       <w:pPr>
         <w:pStyle w:val="PargrafodaLista"/>
@@ -777,39 +828,6 @@
         <w:t xml:space="preserve"> necessitam de serem comprados</w:t>
       </w:r>
     </w:p>
-    <w:p>
-      <w:pPr>
-        <w:pStyle w:val="PargrafodaLista"/>
-        <w:numPr>
-          <w:ilvl w:val="0"/>
-          <w:numId w:val="1"/>
-        </w:numPr>
-        <w:jc w:val="both"/>
-        <w:rPr>
-          <w:rFonts w:ascii="Arial" w:hAnsi="Arial" w:cs="Arial"/>
-        </w:rPr>
-      </w:pPr>
-      <w:bookmarkStart w:id="8" w:name="_Hlk199965370"/>
-      <w:r>
-        <w:rPr>
-          <w:rFonts w:ascii="Arial" w:hAnsi="Arial" w:cs="Arial"/>
-        </w:rPr>
-        <w:t xml:space="preserve">Liste os clientes e </w:t>
-      </w:r>
-      <w:r>
-        <w:rPr>
-          <w:rFonts w:ascii="Arial" w:hAnsi="Arial" w:cs="Arial"/>
-        </w:rPr>
-        <w:t>o</w:t>
-      </w:r>
-      <w:r>
-        <w:rPr>
-          <w:rFonts w:ascii="Arial" w:hAnsi="Arial" w:cs="Arial"/>
-        </w:rPr>
-        <w:t>s produtos que ele comprou</w:t>
-      </w:r>
-    </w:p>
-    <w:bookmarkEnd w:id="8"/>
     <w:p>
       <w:pPr>
         <w:pStyle w:val="PargrafodaLista"/>

</xml_diff>

<commit_message>
Lista atualizada até questão 41
</commit_message>
<xml_diff>
--- a/Lista/Pergutas/Lista 01.docx
+++ b/Lista/Pergutas/Lista 01.docx
@@ -713,7 +713,180 @@
           <w:rFonts w:ascii="Arial" w:hAnsi="Arial" w:cs="Arial"/>
         </w:rPr>
       </w:pPr>
-      <w:bookmarkStart w:id="5" w:name="_Hlk199742967"/>
+      <w:bookmarkStart w:id="5" w:name="_Hlk201900371"/>
+      <w:r>
+        <w:rPr>
+          <w:rFonts w:ascii="Arial" w:hAnsi="Arial" w:cs="Arial"/>
+        </w:rPr>
+        <w:t>Quais os</w:t>
+      </w:r>
+      <w:r>
+        <w:rPr>
+          <w:rFonts w:ascii="Arial" w:hAnsi="Arial" w:cs="Arial"/>
+        </w:rPr>
+        <w:t xml:space="preserve"> clientes que residem </w:t>
+      </w:r>
+      <w:r>
+        <w:rPr>
+          <w:rFonts w:ascii="Arial" w:hAnsi="Arial" w:cs="Arial"/>
+        </w:rPr>
+        <w:t xml:space="preserve">no </w:t>
+      </w:r>
+      <w:r>
+        <w:rPr>
+          <w:rFonts w:ascii="Arial" w:hAnsi="Arial" w:cs="Arial"/>
+        </w:rPr>
+        <w:t>país ‘</w:t>
+      </w:r>
+      <w:r>
+        <w:rPr>
+          <w:rFonts w:ascii="Arial" w:hAnsi="Arial" w:cs="Arial"/>
+        </w:rPr>
+        <w:t>B</w:t>
+      </w:r>
+      <w:r>
+        <w:rPr>
+          <w:rFonts w:ascii="Arial" w:hAnsi="Arial" w:cs="Arial"/>
+        </w:rPr>
+        <w:t>R</w:t>
+      </w:r>
+      <w:r>
+        <w:rPr>
+          <w:rFonts w:ascii="Arial" w:hAnsi="Arial" w:cs="Arial"/>
+        </w:rPr>
+        <w:t>'</w:t>
+      </w:r>
+      <w:r>
+        <w:rPr>
+          <w:rFonts w:ascii="Arial" w:hAnsi="Arial" w:cs="Arial"/>
+        </w:rPr>
+        <w:t xml:space="preserve"> </w:t>
+      </w:r>
+      <w:r>
+        <w:rPr>
+          <w:rFonts w:ascii="Arial" w:hAnsi="Arial" w:cs="Arial"/>
+        </w:rPr>
+        <w:t xml:space="preserve">e </w:t>
+      </w:r>
+      <w:r>
+        <w:rPr>
+          <w:rFonts w:ascii="Arial" w:hAnsi="Arial" w:cs="Arial"/>
+        </w:rPr>
+        <w:t>nos estados de</w:t>
+      </w:r>
+      <w:r>
+        <w:rPr>
+          <w:rFonts w:ascii="Arial" w:hAnsi="Arial" w:cs="Arial"/>
+        </w:rPr>
+        <w:t>, '</w:t>
+      </w:r>
+      <w:r>
+        <w:rPr>
+          <w:rFonts w:ascii="Arial" w:hAnsi="Arial" w:cs="Arial"/>
+        </w:rPr>
+        <w:t>P</w:t>
+      </w:r>
+      <w:r>
+        <w:rPr>
+          <w:rFonts w:ascii="Arial" w:hAnsi="Arial" w:cs="Arial"/>
+        </w:rPr>
+        <w:t>E</w:t>
+      </w:r>
+      <w:proofErr w:type="gramStart"/>
+      <w:r>
+        <w:rPr>
+          <w:rFonts w:ascii="Arial" w:hAnsi="Arial" w:cs="Arial"/>
+        </w:rPr>
+        <w:t xml:space="preserve">' </w:t>
+      </w:r>
+      <w:r>
+        <w:rPr>
+          <w:rFonts w:ascii="Arial" w:hAnsi="Arial" w:cs="Arial"/>
+        </w:rPr>
+        <w:t>,</w:t>
+      </w:r>
+      <w:proofErr w:type="gramEnd"/>
+      <w:r>
+        <w:rPr>
+          <w:rFonts w:ascii="Arial" w:hAnsi="Arial" w:cs="Arial"/>
+        </w:rPr>
+        <w:t xml:space="preserve"> </w:t>
+      </w:r>
+      <w:r>
+        <w:rPr>
+          <w:rFonts w:ascii="Arial" w:hAnsi="Arial" w:cs="Arial"/>
+        </w:rPr>
+        <w:t>'</w:t>
+      </w:r>
+      <w:r>
+        <w:rPr>
+          <w:rFonts w:ascii="Arial" w:hAnsi="Arial" w:cs="Arial"/>
+        </w:rPr>
+        <w:t>A</w:t>
+      </w:r>
+      <w:r>
+        <w:rPr>
+          <w:rFonts w:ascii="Arial" w:hAnsi="Arial" w:cs="Arial"/>
+        </w:rPr>
+        <w:t>L</w:t>
+      </w:r>
+      <w:r>
+        <w:rPr>
+          <w:rFonts w:ascii="Arial" w:hAnsi="Arial" w:cs="Arial"/>
+        </w:rPr>
+        <w:t>'</w:t>
+      </w:r>
+      <w:r>
+        <w:rPr>
+          <w:rFonts w:ascii="Arial" w:hAnsi="Arial" w:cs="Arial"/>
+        </w:rPr>
+        <w:t xml:space="preserve"> </w:t>
+      </w:r>
+      <w:r>
+        <w:rPr>
+          <w:rFonts w:ascii="Arial" w:hAnsi="Arial" w:cs="Arial"/>
+        </w:rPr>
+        <w:t xml:space="preserve">e </w:t>
+      </w:r>
+      <w:r>
+        <w:rPr>
+          <w:rFonts w:ascii="Arial" w:hAnsi="Arial" w:cs="Arial"/>
+        </w:rPr>
+        <w:t>‘B</w:t>
+      </w:r>
+      <w:r>
+        <w:rPr>
+          <w:rFonts w:ascii="Arial" w:hAnsi="Arial" w:cs="Arial"/>
+        </w:rPr>
+        <w:t>A</w:t>
+      </w:r>
+      <w:r>
+        <w:rPr>
+          <w:rFonts w:ascii="Arial" w:hAnsi="Arial" w:cs="Arial"/>
+        </w:rPr>
+        <w:t xml:space="preserve">’ </w:t>
+      </w:r>
+      <w:r>
+        <w:rPr>
+          <w:rFonts w:ascii="Arial" w:hAnsi="Arial" w:cs="Arial"/>
+        </w:rPr>
+        <w:t xml:space="preserve"> </w:t>
+      </w:r>
+    </w:p>
+    <w:p>
+      <w:pPr>
+        <w:pStyle w:val="PargrafodaLista"/>
+        <w:numPr>
+          <w:ilvl w:val="0"/>
+          <w:numId w:val="1"/>
+        </w:numPr>
+        <w:jc w:val="both"/>
+        <w:rPr>
+          <w:rFonts w:ascii="Arial" w:hAnsi="Arial" w:cs="Arial"/>
+        </w:rPr>
+      </w:pPr>
+      <w:bookmarkStart w:id="6" w:name="_Hlk199742967"/>
+      <w:bookmarkEnd w:id="5"/>
       <w:r>
         <w:rPr>
           <w:rFonts w:ascii="Arial" w:hAnsi="Arial" w:cs="Arial"/>
@@ -733,29 +906,29 @@
           <w:rFonts w:ascii="Arial" w:hAnsi="Arial" w:cs="Arial"/>
         </w:rPr>
       </w:pPr>
-      <w:bookmarkStart w:id="6" w:name="_Hlk199965370"/>
+      <w:bookmarkStart w:id="7" w:name="_Hlk199965370"/>
       <w:r>
         <w:rPr>
           <w:rFonts w:ascii="Arial" w:hAnsi="Arial" w:cs="Arial"/>
         </w:rPr>
         <w:t>Liste os clientes e os produtos que ele comprou</w:t>
       </w:r>
+      <w:bookmarkEnd w:id="7"/>
+    </w:p>
+    <w:p>
+      <w:pPr>
+        <w:pStyle w:val="PargrafodaLista"/>
+        <w:numPr>
+          <w:ilvl w:val="0"/>
+          <w:numId w:val="1"/>
+        </w:numPr>
+        <w:jc w:val="both"/>
+        <w:rPr>
+          <w:rFonts w:ascii="Arial" w:hAnsi="Arial" w:cs="Arial"/>
+        </w:rPr>
+      </w:pPr>
+      <w:bookmarkStart w:id="8" w:name="_Hlk199743172"/>
       <w:bookmarkEnd w:id="6"/>
-    </w:p>
-    <w:p>
-      <w:pPr>
-        <w:pStyle w:val="PargrafodaLista"/>
-        <w:numPr>
-          <w:ilvl w:val="0"/>
-          <w:numId w:val="1"/>
-        </w:numPr>
-        <w:jc w:val="both"/>
-        <w:rPr>
-          <w:rFonts w:ascii="Arial" w:hAnsi="Arial" w:cs="Arial"/>
-        </w:rPr>
-      </w:pPr>
-      <w:bookmarkStart w:id="7" w:name="_Hlk199743172"/>
-      <w:bookmarkEnd w:id="5"/>
       <w:r>
         <w:rPr>
           <w:rFonts w:ascii="Arial" w:hAnsi="Arial" w:cs="Arial"/>
@@ -774,7 +947,7 @@
         </w:rPr>
         <w:t xml:space="preserve"> o nome e o E-mail de todos os clientes VIP</w:t>
       </w:r>
-      <w:bookmarkEnd w:id="7"/>
+      <w:bookmarkEnd w:id="8"/>
       <w:r>
         <w:rPr>
           <w:rFonts w:ascii="Arial" w:hAnsi="Arial" w:cs="Arial"/>
@@ -794,7 +967,7 @@
           <w:rFonts w:ascii="Arial" w:hAnsi="Arial" w:cs="Arial"/>
         </w:rPr>
       </w:pPr>
-      <w:bookmarkStart w:id="8" w:name="_Hlk199744044"/>
+      <w:bookmarkStart w:id="9" w:name="_Hlk199744044"/>
       <w:r>
         <w:rPr>
           <w:rFonts w:ascii="Arial" w:hAnsi="Arial" w:cs="Arial"/>
@@ -802,7 +975,7 @@
         <w:t>Quais os clientes que só fizeram uma compra na nossa loja?</w:t>
       </w:r>
     </w:p>
-    <w:bookmarkEnd w:id="8"/>
+    <w:bookmarkEnd w:id="9"/>
     <w:p>
       <w:pPr>
         <w:pStyle w:val="PargrafodaLista"/>
@@ -863,56 +1036,439 @@
         <w:rPr>
           <w:rFonts w:ascii="Arial" w:hAnsi="Arial" w:cs="Arial"/>
         </w:rPr>
-        <w:t>Quais os</w:t>
-      </w:r>
-      <w:r>
-        <w:rPr>
-          <w:rFonts w:ascii="Arial" w:hAnsi="Arial" w:cs="Arial"/>
-        </w:rPr>
-        <w:t xml:space="preserve"> clientes que residem </w:t>
-      </w:r>
-      <w:r>
-        <w:rPr>
-          <w:rFonts w:ascii="Arial" w:hAnsi="Arial" w:cs="Arial"/>
-        </w:rPr>
-        <w:t xml:space="preserve">no Brasil e </w:t>
-      </w:r>
-      <w:r>
-        <w:rPr>
-          <w:rFonts w:ascii="Arial" w:hAnsi="Arial" w:cs="Arial"/>
-        </w:rPr>
-        <w:t xml:space="preserve">nos estados de </w:t>
-      </w:r>
-      <w:r>
-        <w:rPr>
-          <w:rFonts w:ascii="Arial" w:hAnsi="Arial" w:cs="Arial"/>
-        </w:rPr>
-        <w:t>'Rio Grande do Sul', 'Santa Catarina' e 'Paraná'</w:t>
-      </w:r>
-      <w:r>
-        <w:rPr>
-          <w:rFonts w:ascii="Arial" w:hAnsi="Arial" w:cs="Arial"/>
-        </w:rPr>
-        <w:t xml:space="preserve"> </w:t>
-      </w:r>
-    </w:p>
-    <w:p>
-      <w:pPr>
-        <w:pStyle w:val="PargrafodaLista"/>
-        <w:numPr>
-          <w:ilvl w:val="0"/>
-          <w:numId w:val="1"/>
-        </w:numPr>
-        <w:jc w:val="both"/>
-        <w:rPr>
-          <w:rFonts w:ascii="Arial" w:hAnsi="Arial" w:cs="Arial"/>
-        </w:rPr>
-      </w:pPr>
-      <w:r>
-        <w:rPr>
-          <w:rFonts w:ascii="Arial" w:hAnsi="Arial" w:cs="Arial"/>
-        </w:rPr>
-        <w:lastRenderedPageBreak/>
+        <w:t>Liste os produtos que nunca foram pedidos.</w:t>
+      </w:r>
+    </w:p>
+    <w:p>
+      <w:pPr>
+        <w:pStyle w:val="PargrafodaLista"/>
+        <w:numPr>
+          <w:ilvl w:val="0"/>
+          <w:numId w:val="1"/>
+        </w:numPr>
+        <w:jc w:val="both"/>
+        <w:rPr>
+          <w:rFonts w:ascii="Arial" w:hAnsi="Arial" w:cs="Arial"/>
+        </w:rPr>
+      </w:pPr>
+      <w:bookmarkStart w:id="10" w:name="_Hlk201901157"/>
+      <w:r>
+        <w:rPr>
+          <w:rFonts w:ascii="Arial" w:hAnsi="Arial" w:cs="Arial"/>
+        </w:rPr>
+        <w:t>Quem são os cliente</w:t>
+      </w:r>
+      <w:r>
+        <w:rPr>
+          <w:rFonts w:ascii="Arial" w:hAnsi="Arial" w:cs="Arial"/>
+        </w:rPr>
+        <w:t>s</w:t>
+      </w:r>
+      <w:r>
+        <w:rPr>
+          <w:rFonts w:ascii="Arial" w:hAnsi="Arial" w:cs="Arial"/>
+        </w:rPr>
+        <w:t xml:space="preserve"> com mais e menos idade?</w:t>
+      </w:r>
+      <w:bookmarkEnd w:id="10"/>
+    </w:p>
+    <w:p>
+      <w:pPr>
+        <w:pStyle w:val="PargrafodaLista"/>
+        <w:numPr>
+          <w:ilvl w:val="0"/>
+          <w:numId w:val="1"/>
+        </w:numPr>
+        <w:jc w:val="both"/>
+        <w:rPr>
+          <w:rFonts w:ascii="Arial" w:hAnsi="Arial" w:cs="Arial"/>
+        </w:rPr>
+      </w:pPr>
+      <w:bookmarkStart w:id="11" w:name="_Hlk201901455"/>
+      <w:r>
+        <w:rPr>
+          <w:rFonts w:ascii="Arial" w:hAnsi="Arial" w:cs="Arial"/>
+        </w:rPr>
+        <w:t>Q</w:t>
+      </w:r>
+      <w:r>
+        <w:rPr>
+          <w:rFonts w:ascii="Arial" w:hAnsi="Arial" w:cs="Arial"/>
+        </w:rPr>
+        <w:t>ua</w:t>
+      </w:r>
+      <w:r>
+        <w:rPr>
+          <w:rFonts w:ascii="Arial" w:hAnsi="Arial" w:cs="Arial"/>
+        </w:rPr>
+        <w:t>is</w:t>
+      </w:r>
+      <w:r>
+        <w:rPr>
+          <w:rFonts w:ascii="Arial" w:hAnsi="Arial" w:cs="Arial"/>
+        </w:rPr>
+        <w:t xml:space="preserve"> são as categorias que foram compradas por clientes na </w:t>
+      </w:r>
+      <w:r>
+        <w:rPr>
+          <w:rFonts w:ascii="Arial" w:hAnsi="Arial" w:cs="Arial"/>
+        </w:rPr>
+        <w:t>A</w:t>
+      </w:r>
+      <w:r>
+        <w:rPr>
+          <w:rFonts w:ascii="Arial" w:hAnsi="Arial" w:cs="Arial"/>
+        </w:rPr>
+        <w:t>lbânia</w:t>
+      </w:r>
+      <w:r>
+        <w:rPr>
+          <w:rFonts w:ascii="Arial" w:hAnsi="Arial" w:cs="Arial"/>
+        </w:rPr>
+        <w:t>?</w:t>
+      </w:r>
+      <w:bookmarkEnd w:id="11"/>
+    </w:p>
+    <w:p>
+      <w:pPr>
+        <w:pStyle w:val="PargrafodaLista"/>
+        <w:numPr>
+          <w:ilvl w:val="0"/>
+          <w:numId w:val="1"/>
+        </w:numPr>
+        <w:jc w:val="both"/>
+        <w:rPr>
+          <w:rFonts w:ascii="Arial" w:hAnsi="Arial" w:cs="Arial"/>
+        </w:rPr>
+      </w:pPr>
+      <w:bookmarkStart w:id="12" w:name="_Hlk201901884"/>
+      <w:r>
+        <w:rPr>
+          <w:rFonts w:ascii="Arial" w:hAnsi="Arial" w:cs="Arial"/>
+        </w:rPr>
+        <w:t xml:space="preserve">Quais são os produtos que nunca foram comprados por clientes </w:t>
+      </w:r>
+      <w:r>
+        <w:rPr>
+          <w:rFonts w:ascii="Arial" w:hAnsi="Arial" w:cs="Arial"/>
+        </w:rPr>
+        <w:t>no</w:t>
+      </w:r>
+      <w:r>
+        <w:rPr>
+          <w:rFonts w:ascii="Arial" w:hAnsi="Arial" w:cs="Arial"/>
+        </w:rPr>
+        <w:t xml:space="preserve"> Congo?</w:t>
+      </w:r>
+      <w:bookmarkEnd w:id="12"/>
+    </w:p>
+    <w:p>
+      <w:pPr>
+        <w:pStyle w:val="PargrafodaLista"/>
+        <w:numPr>
+          <w:ilvl w:val="0"/>
+          <w:numId w:val="1"/>
+        </w:numPr>
+        <w:jc w:val="both"/>
+        <w:rPr>
+          <w:rFonts w:ascii="Arial" w:hAnsi="Arial" w:cs="Arial"/>
+        </w:rPr>
+      </w:pPr>
+      <w:bookmarkStart w:id="13" w:name="_Hlk201902294"/>
+      <w:r>
+        <w:rPr>
+          <w:rFonts w:ascii="Arial" w:hAnsi="Arial" w:cs="Arial"/>
+        </w:rPr>
+        <w:t>Q</w:t>
+      </w:r>
+      <w:r>
+        <w:rPr>
+          <w:rFonts w:ascii="Arial" w:hAnsi="Arial" w:cs="Arial"/>
+        </w:rPr>
+        <w:t xml:space="preserve">ual a </w:t>
+      </w:r>
+      <w:r>
+        <w:rPr>
+          <w:rFonts w:ascii="Arial" w:hAnsi="Arial" w:cs="Arial"/>
+        </w:rPr>
+        <w:t>tr</w:t>
+      </w:r>
+      <w:r>
+        <w:rPr>
+          <w:rFonts w:ascii="Arial" w:hAnsi="Arial" w:cs="Arial"/>
+        </w:rPr>
+        <w:t>ansportadora que mais tran</w:t>
+      </w:r>
+      <w:r>
+        <w:rPr>
+          <w:rFonts w:ascii="Arial" w:hAnsi="Arial" w:cs="Arial"/>
+        </w:rPr>
+        <w:t>s</w:t>
+      </w:r>
+      <w:r>
+        <w:rPr>
+          <w:rFonts w:ascii="Arial" w:hAnsi="Arial" w:cs="Arial"/>
+        </w:rPr>
+        <w:t xml:space="preserve">porte fez para a </w:t>
+      </w:r>
+      <w:r>
+        <w:rPr>
+          <w:rFonts w:ascii="Arial" w:hAnsi="Arial" w:cs="Arial"/>
+        </w:rPr>
+        <w:t>Ar</w:t>
+      </w:r>
+      <w:r>
+        <w:rPr>
+          <w:rFonts w:ascii="Arial" w:hAnsi="Arial" w:cs="Arial"/>
+        </w:rPr>
+        <w:t>gentina</w:t>
+      </w:r>
+      <w:r>
+        <w:rPr>
+          <w:rFonts w:ascii="Arial" w:hAnsi="Arial" w:cs="Arial"/>
+        </w:rPr>
+        <w:t>?</w:t>
+      </w:r>
+      <w:bookmarkEnd w:id="13"/>
+    </w:p>
+    <w:p>
+      <w:pPr>
+        <w:pStyle w:val="PargrafodaLista"/>
+        <w:numPr>
+          <w:ilvl w:val="0"/>
+          <w:numId w:val="1"/>
+        </w:numPr>
+        <w:jc w:val="both"/>
+        <w:rPr>
+          <w:rFonts w:ascii="Arial" w:hAnsi="Arial" w:cs="Arial"/>
+        </w:rPr>
+      </w:pPr>
+      <w:bookmarkStart w:id="14" w:name="_Hlk199778537"/>
+      <w:r>
+        <w:rPr>
+          <w:rFonts w:ascii="Arial" w:hAnsi="Arial" w:cs="Arial"/>
+        </w:rPr>
+        <w:t>Liste o nome do supervisor e seus subordinados</w:t>
+      </w:r>
+    </w:p>
+    <w:p>
+      <w:pPr>
+        <w:pStyle w:val="PargrafodaLista"/>
+        <w:numPr>
+          <w:ilvl w:val="0"/>
+          <w:numId w:val="1"/>
+        </w:numPr>
+        <w:jc w:val="both"/>
+        <w:rPr>
+          <w:rFonts w:ascii="Arial" w:hAnsi="Arial" w:cs="Arial"/>
+        </w:rPr>
+      </w:pPr>
+      <w:r>
+        <w:rPr>
+          <w:rFonts w:ascii="Arial" w:hAnsi="Arial" w:cs="Arial"/>
+        </w:rPr>
+        <w:t>Quais os produtos que têm o preço unitário superior ao preço médio de sua categoria?</w:t>
+      </w:r>
+    </w:p>
+    <w:bookmarkEnd w:id="14"/>
+    <w:p>
+      <w:pPr>
+        <w:pStyle w:val="PargrafodaLista"/>
+        <w:numPr>
+          <w:ilvl w:val="0"/>
+          <w:numId w:val="1"/>
+        </w:numPr>
+        <w:jc w:val="both"/>
+        <w:rPr>
+          <w:rFonts w:ascii="Arial" w:hAnsi="Arial" w:cs="Arial"/>
+        </w:rPr>
+      </w:pPr>
+      <w:r>
+        <w:rPr>
+          <w:rFonts w:ascii="Arial" w:hAnsi="Arial" w:cs="Arial"/>
+        </w:rPr>
+        <w:t>Qual o faturamento por país considerando os descontos?</w:t>
+      </w:r>
+    </w:p>
+    <w:p>
+      <w:pPr>
+        <w:pStyle w:val="PargrafodaLista"/>
+        <w:numPr>
+          <w:ilvl w:val="0"/>
+          <w:numId w:val="1"/>
+        </w:numPr>
+        <w:jc w:val="both"/>
+        <w:rPr>
+          <w:rFonts w:ascii="Arial" w:hAnsi="Arial" w:cs="Arial"/>
+        </w:rPr>
+      </w:pPr>
+      <w:r>
+        <w:rPr>
+          <w:rFonts w:ascii="Arial" w:hAnsi="Arial" w:cs="Arial"/>
+        </w:rPr>
+        <w:t>Considerando o valor final do pedido qual vendedor tem a maior média de venda?</w:t>
+      </w:r>
+    </w:p>
+    <w:p>
+      <w:pPr>
+        <w:pStyle w:val="PargrafodaLista"/>
+        <w:numPr>
+          <w:ilvl w:val="0"/>
+          <w:numId w:val="1"/>
+        </w:numPr>
+        <w:jc w:val="both"/>
+        <w:rPr>
+          <w:rFonts w:ascii="Arial" w:hAnsi="Arial" w:cs="Arial"/>
+        </w:rPr>
+      </w:pPr>
+      <w:r>
+        <w:rPr>
+          <w:rFonts w:ascii="Arial" w:hAnsi="Arial" w:cs="Arial"/>
+        </w:rPr>
+        <w:t>Liste todas as pessoas que t</w:t>
+      </w:r>
+      <w:r>
+        <w:rPr>
+          <w:rFonts w:ascii="Arial" w:hAnsi="Arial" w:cs="Arial"/>
+        </w:rPr>
+        <w:t>ê</w:t>
+      </w:r>
+      <w:r>
+        <w:rPr>
+          <w:rFonts w:ascii="Arial" w:hAnsi="Arial" w:cs="Arial"/>
+        </w:rPr>
+        <w:t>m algum relacionamento com a empresa e qual é esse relacionamento</w:t>
+      </w:r>
+    </w:p>
+    <w:p>
+      <w:pPr>
+        <w:pStyle w:val="PargrafodaLista"/>
+        <w:numPr>
+          <w:ilvl w:val="0"/>
+          <w:numId w:val="1"/>
+        </w:numPr>
+        <w:jc w:val="both"/>
+        <w:rPr>
+          <w:rFonts w:ascii="Arial" w:hAnsi="Arial" w:cs="Arial"/>
+        </w:rPr>
+      </w:pPr>
+      <w:bookmarkStart w:id="15" w:name="_Hlk200183669"/>
+      <w:r>
+        <w:rPr>
+          <w:rFonts w:ascii="Arial" w:hAnsi="Arial" w:cs="Arial"/>
+        </w:rPr>
+        <w:t>Liste o produto e a evolução de seu preço ao longo do tempo</w:t>
+      </w:r>
+      <w:bookmarkEnd w:id="15"/>
+    </w:p>
+    <w:p>
+      <w:pPr>
+        <w:pStyle w:val="PargrafodaLista"/>
+        <w:numPr>
+          <w:ilvl w:val="0"/>
+          <w:numId w:val="1"/>
+        </w:numPr>
+        <w:jc w:val="both"/>
+        <w:rPr>
+          <w:rFonts w:ascii="Arial" w:hAnsi="Arial" w:cs="Arial"/>
+        </w:rPr>
+      </w:pPr>
+      <w:r>
+        <w:rPr>
+          <w:rFonts w:ascii="Arial" w:hAnsi="Arial" w:cs="Arial"/>
+        </w:rPr>
+        <w:t>Q</w:t>
+      </w:r>
+      <w:r>
+        <w:rPr>
+          <w:rFonts w:ascii="Arial" w:hAnsi="Arial" w:cs="Arial"/>
+        </w:rPr>
+        <w:t>ual é o nome do vendedor que t</w:t>
+      </w:r>
+      <w:r>
+        <w:rPr>
+          <w:rFonts w:ascii="Arial" w:hAnsi="Arial" w:cs="Arial"/>
+        </w:rPr>
+        <w:t>ê</w:t>
+      </w:r>
+      <w:r>
+        <w:rPr>
+          <w:rFonts w:ascii="Arial" w:hAnsi="Arial" w:cs="Arial"/>
+        </w:rPr>
+        <w:t>m sua m</w:t>
+      </w:r>
+      <w:r>
+        <w:rPr>
+          <w:rFonts w:ascii="Arial" w:hAnsi="Arial" w:cs="Arial"/>
+        </w:rPr>
+        <w:t>é</w:t>
+      </w:r>
+      <w:r>
+        <w:rPr>
+          <w:rFonts w:ascii="Arial" w:hAnsi="Arial" w:cs="Arial"/>
+        </w:rPr>
+        <w:t xml:space="preserve">dia de vendas maior que </w:t>
+      </w:r>
+      <w:r>
+        <w:rPr>
+          <w:rFonts w:ascii="Arial" w:hAnsi="Arial" w:cs="Arial"/>
+        </w:rPr>
+        <w:t>média</w:t>
+      </w:r>
+      <w:r>
+        <w:rPr>
+          <w:rFonts w:ascii="Arial" w:hAnsi="Arial" w:cs="Arial"/>
+        </w:rPr>
+        <w:t xml:space="preserve"> dos demais vendedores</w:t>
+      </w:r>
+    </w:p>
+    <w:p>
+      <w:pPr>
+        <w:pStyle w:val="PargrafodaLista"/>
+        <w:numPr>
+          <w:ilvl w:val="0"/>
+          <w:numId w:val="1"/>
+        </w:numPr>
+        <w:jc w:val="both"/>
+        <w:rPr>
+          <w:rFonts w:ascii="Arial" w:hAnsi="Arial" w:cs="Arial"/>
+        </w:rPr>
+      </w:pPr>
+      <w:r>
+        <w:rPr>
+          <w:rFonts w:ascii="Arial" w:hAnsi="Arial" w:cs="Arial"/>
+        </w:rPr>
+        <w:t xml:space="preserve">Quem é o melhor vendedor em valor de vendas de cada </w:t>
+      </w:r>
+      <w:r>
+        <w:rPr>
+          <w:rFonts w:ascii="Arial" w:hAnsi="Arial" w:cs="Arial"/>
+        </w:rPr>
+        <w:t>c</w:t>
+      </w:r>
+      <w:r>
+        <w:rPr>
+          <w:rFonts w:ascii="Arial" w:hAnsi="Arial" w:cs="Arial"/>
+        </w:rPr>
+        <w:t>ategoria considerando os últimos 12 meses</w:t>
+      </w:r>
+    </w:p>
+    <w:p>
+      <w:pPr>
+        <w:pStyle w:val="PargrafodaLista"/>
+        <w:numPr>
+          <w:ilvl w:val="0"/>
+          <w:numId w:val="1"/>
+        </w:numPr>
+        <w:jc w:val="both"/>
+        <w:rPr>
+          <w:rFonts w:ascii="Arial" w:hAnsi="Arial" w:cs="Arial"/>
+        </w:rPr>
+      </w:pPr>
+      <w:r>
+        <w:rPr>
+          <w:rFonts w:ascii="Arial" w:hAnsi="Arial" w:cs="Arial"/>
+        </w:rPr>
         <w:t xml:space="preserve">Quais itens foram incluídos em pedidos onde o frete foi superior a R$50 e a data do pedido foi </w:t>
       </w:r>
       <w:r>
@@ -962,447 +1518,6 @@
           <w:rFonts w:ascii="Arial" w:hAnsi="Arial" w:cs="Arial"/>
         </w:rPr>
         <w:t>'</w:t>
-      </w:r>
-    </w:p>
-    <w:p>
-      <w:pPr>
-        <w:pStyle w:val="PargrafodaLista"/>
-        <w:numPr>
-          <w:ilvl w:val="0"/>
-          <w:numId w:val="1"/>
-        </w:numPr>
-        <w:jc w:val="both"/>
-        <w:rPr>
-          <w:rFonts w:ascii="Arial" w:hAnsi="Arial" w:cs="Arial"/>
-        </w:rPr>
-      </w:pPr>
-      <w:r>
-        <w:rPr>
-          <w:rFonts w:ascii="Arial" w:hAnsi="Arial" w:cs="Arial"/>
-        </w:rPr>
-        <w:t>Liste os produtos que nunca foram pedidos.</w:t>
-      </w:r>
-    </w:p>
-    <w:p>
-      <w:pPr>
-        <w:pStyle w:val="PargrafodaLista"/>
-        <w:numPr>
-          <w:ilvl w:val="0"/>
-          <w:numId w:val="1"/>
-        </w:numPr>
-        <w:jc w:val="both"/>
-        <w:rPr>
-          <w:rFonts w:ascii="Arial" w:hAnsi="Arial" w:cs="Arial"/>
-        </w:rPr>
-      </w:pPr>
-      <w:r>
-        <w:rPr>
-          <w:rFonts w:ascii="Arial" w:hAnsi="Arial" w:cs="Arial"/>
-        </w:rPr>
-        <w:t xml:space="preserve">Quais pedidos tiveram desconto aplicado e foram realizados </w:t>
-      </w:r>
-      <w:r>
-        <w:rPr>
-          <w:rFonts w:ascii="Arial" w:hAnsi="Arial" w:cs="Arial"/>
-        </w:rPr>
-        <w:t xml:space="preserve">por </w:t>
-      </w:r>
-      <w:r>
-        <w:rPr>
-          <w:rFonts w:ascii="Arial" w:hAnsi="Arial" w:cs="Arial"/>
-        </w:rPr>
-        <w:t>vendedores</w:t>
-      </w:r>
-      <w:r>
-        <w:rPr>
-          <w:rFonts w:ascii="Arial" w:hAnsi="Arial" w:cs="Arial"/>
-        </w:rPr>
-        <w:t xml:space="preserve"> </w:t>
-      </w:r>
-      <w:r>
-        <w:rPr>
-          <w:rFonts w:ascii="Arial" w:hAnsi="Arial" w:cs="Arial"/>
-        </w:rPr>
-        <w:t>da Alemanha</w:t>
-      </w:r>
-      <w:r>
-        <w:rPr>
-          <w:rFonts w:ascii="Arial" w:hAnsi="Arial" w:cs="Arial"/>
-        </w:rPr>
-        <w:t>?</w:t>
-      </w:r>
-    </w:p>
-    <w:p>
-      <w:pPr>
-        <w:pStyle w:val="PargrafodaLista"/>
-        <w:numPr>
-          <w:ilvl w:val="0"/>
-          <w:numId w:val="1"/>
-        </w:numPr>
-        <w:jc w:val="both"/>
-        <w:rPr>
-          <w:rFonts w:ascii="Arial" w:hAnsi="Arial" w:cs="Arial"/>
-        </w:rPr>
-      </w:pPr>
-      <w:r>
-        <w:rPr>
-          <w:rFonts w:ascii="Arial" w:hAnsi="Arial" w:cs="Arial"/>
-        </w:rPr>
-        <w:t>Q</w:t>
-      </w:r>
-      <w:r>
-        <w:rPr>
-          <w:rFonts w:ascii="Arial" w:hAnsi="Arial" w:cs="Arial"/>
-        </w:rPr>
-        <w:t>ua</w:t>
-      </w:r>
-      <w:r>
-        <w:rPr>
-          <w:rFonts w:ascii="Arial" w:hAnsi="Arial" w:cs="Arial"/>
-        </w:rPr>
-        <w:t>is</w:t>
-      </w:r>
-      <w:r>
-        <w:rPr>
-          <w:rFonts w:ascii="Arial" w:hAnsi="Arial" w:cs="Arial"/>
-        </w:rPr>
-        <w:t xml:space="preserve"> são as categorias que foram compradas por clientes na </w:t>
-      </w:r>
-      <w:r>
-        <w:rPr>
-          <w:rFonts w:ascii="Arial" w:hAnsi="Arial" w:cs="Arial"/>
-        </w:rPr>
-        <w:t>A</w:t>
-      </w:r>
-      <w:r>
-        <w:rPr>
-          <w:rFonts w:ascii="Arial" w:hAnsi="Arial" w:cs="Arial"/>
-        </w:rPr>
-        <w:t>lbânia</w:t>
-      </w:r>
-      <w:r>
-        <w:rPr>
-          <w:rFonts w:ascii="Arial" w:hAnsi="Arial" w:cs="Arial"/>
-        </w:rPr>
-        <w:t>?</w:t>
-      </w:r>
-    </w:p>
-    <w:p>
-      <w:pPr>
-        <w:pStyle w:val="PargrafodaLista"/>
-        <w:numPr>
-          <w:ilvl w:val="0"/>
-          <w:numId w:val="1"/>
-        </w:numPr>
-        <w:jc w:val="both"/>
-        <w:rPr>
-          <w:rFonts w:ascii="Arial" w:hAnsi="Arial" w:cs="Arial"/>
-        </w:rPr>
-      </w:pPr>
-      <w:r>
-        <w:rPr>
-          <w:rFonts w:ascii="Arial" w:hAnsi="Arial" w:cs="Arial"/>
-        </w:rPr>
-        <w:t>Quais são os produtos que nunca foram comprados por clientes do Congo?</w:t>
-      </w:r>
-    </w:p>
-    <w:p>
-      <w:pPr>
-        <w:pStyle w:val="PargrafodaLista"/>
-        <w:numPr>
-          <w:ilvl w:val="0"/>
-          <w:numId w:val="1"/>
-        </w:numPr>
-        <w:jc w:val="both"/>
-        <w:rPr>
-          <w:rFonts w:ascii="Arial" w:hAnsi="Arial" w:cs="Arial"/>
-        </w:rPr>
-      </w:pPr>
-      <w:r>
-        <w:rPr>
-          <w:rFonts w:ascii="Arial" w:hAnsi="Arial" w:cs="Arial"/>
-        </w:rPr>
-        <w:t>Q</w:t>
-      </w:r>
-      <w:r>
-        <w:rPr>
-          <w:rFonts w:ascii="Arial" w:hAnsi="Arial" w:cs="Arial"/>
-        </w:rPr>
-        <w:t xml:space="preserve">ual a </w:t>
-      </w:r>
-      <w:r>
-        <w:rPr>
-          <w:rFonts w:ascii="Arial" w:hAnsi="Arial" w:cs="Arial"/>
-        </w:rPr>
-        <w:t>tr</w:t>
-      </w:r>
-      <w:r>
-        <w:rPr>
-          <w:rFonts w:ascii="Arial" w:hAnsi="Arial" w:cs="Arial"/>
-        </w:rPr>
-        <w:t>ansportadora que mais tran</w:t>
-      </w:r>
-      <w:r>
-        <w:rPr>
-          <w:rFonts w:ascii="Arial" w:hAnsi="Arial" w:cs="Arial"/>
-        </w:rPr>
-        <w:t>s</w:t>
-      </w:r>
-      <w:r>
-        <w:rPr>
-          <w:rFonts w:ascii="Arial" w:hAnsi="Arial" w:cs="Arial"/>
-        </w:rPr>
-        <w:t xml:space="preserve">porte fez para a </w:t>
-      </w:r>
-      <w:proofErr w:type="spellStart"/>
-      <w:r>
-        <w:rPr>
-          <w:rFonts w:ascii="Arial" w:hAnsi="Arial" w:cs="Arial"/>
-        </w:rPr>
-        <w:t>a</w:t>
-      </w:r>
-      <w:r>
-        <w:rPr>
-          <w:rFonts w:ascii="Arial" w:hAnsi="Arial" w:cs="Arial"/>
-        </w:rPr>
-        <w:t>Ar</w:t>
-      </w:r>
-      <w:r>
-        <w:rPr>
-          <w:rFonts w:ascii="Arial" w:hAnsi="Arial" w:cs="Arial"/>
-        </w:rPr>
-        <w:t>gentina</w:t>
-      </w:r>
-      <w:proofErr w:type="spellEnd"/>
-      <w:r>
-        <w:rPr>
-          <w:rFonts w:ascii="Arial" w:hAnsi="Arial" w:cs="Arial"/>
-        </w:rPr>
-        <w:t>?</w:t>
-      </w:r>
-    </w:p>
-    <w:p>
-      <w:pPr>
-        <w:pStyle w:val="PargrafodaLista"/>
-        <w:numPr>
-          <w:ilvl w:val="0"/>
-          <w:numId w:val="1"/>
-        </w:numPr>
-        <w:jc w:val="both"/>
-        <w:rPr>
-          <w:rFonts w:ascii="Arial" w:hAnsi="Arial" w:cs="Arial"/>
-        </w:rPr>
-      </w:pPr>
-      <w:bookmarkStart w:id="9" w:name="_Hlk199778537"/>
-      <w:r>
-        <w:rPr>
-          <w:rFonts w:ascii="Arial" w:hAnsi="Arial" w:cs="Arial"/>
-        </w:rPr>
-        <w:t>Liste o nome do supervisor e seus subordinados</w:t>
-      </w:r>
-    </w:p>
-    <w:p>
-      <w:pPr>
-        <w:pStyle w:val="PargrafodaLista"/>
-        <w:numPr>
-          <w:ilvl w:val="0"/>
-          <w:numId w:val="1"/>
-        </w:numPr>
-        <w:jc w:val="both"/>
-        <w:rPr>
-          <w:rFonts w:ascii="Arial" w:hAnsi="Arial" w:cs="Arial"/>
-        </w:rPr>
-      </w:pPr>
-      <w:r>
-        <w:rPr>
-          <w:rFonts w:ascii="Arial" w:hAnsi="Arial" w:cs="Arial"/>
-        </w:rPr>
-        <w:t>Quais os produtos que têm o preço unitário superior ao preço médio de sua categoria?</w:t>
-      </w:r>
-    </w:p>
-    <w:bookmarkEnd w:id="9"/>
-    <w:p>
-      <w:pPr>
-        <w:pStyle w:val="PargrafodaLista"/>
-        <w:numPr>
-          <w:ilvl w:val="0"/>
-          <w:numId w:val="1"/>
-        </w:numPr>
-        <w:jc w:val="both"/>
-        <w:rPr>
-          <w:rFonts w:ascii="Arial" w:hAnsi="Arial" w:cs="Arial"/>
-        </w:rPr>
-      </w:pPr>
-      <w:r>
-        <w:rPr>
-          <w:rFonts w:ascii="Arial" w:hAnsi="Arial" w:cs="Arial"/>
-        </w:rPr>
-        <w:t>Qual o faturamento por país considerando os descontos?</w:t>
-      </w:r>
-    </w:p>
-    <w:p>
-      <w:pPr>
-        <w:pStyle w:val="PargrafodaLista"/>
-        <w:numPr>
-          <w:ilvl w:val="0"/>
-          <w:numId w:val="1"/>
-        </w:numPr>
-        <w:jc w:val="both"/>
-        <w:rPr>
-          <w:rFonts w:ascii="Arial" w:hAnsi="Arial" w:cs="Arial"/>
-        </w:rPr>
-      </w:pPr>
-      <w:r>
-        <w:rPr>
-          <w:rFonts w:ascii="Arial" w:hAnsi="Arial" w:cs="Arial"/>
-        </w:rPr>
-        <w:t>Considerando o valor final do pedido qual vendedor tem a maior média de venda?</w:t>
-      </w:r>
-    </w:p>
-    <w:p>
-      <w:pPr>
-        <w:pStyle w:val="PargrafodaLista"/>
-        <w:numPr>
-          <w:ilvl w:val="0"/>
-          <w:numId w:val="1"/>
-        </w:numPr>
-        <w:jc w:val="both"/>
-        <w:rPr>
-          <w:rFonts w:ascii="Arial" w:hAnsi="Arial" w:cs="Arial"/>
-        </w:rPr>
-      </w:pPr>
-      <w:r>
-        <w:rPr>
-          <w:rFonts w:ascii="Arial" w:hAnsi="Arial" w:cs="Arial"/>
-        </w:rPr>
-        <w:t xml:space="preserve">Liste todas as pessoas que </w:t>
-      </w:r>
-      <w:proofErr w:type="gramStart"/>
-      <w:r>
-        <w:rPr>
-          <w:rFonts w:ascii="Arial" w:hAnsi="Arial" w:cs="Arial"/>
-        </w:rPr>
-        <w:t>tem</w:t>
-      </w:r>
-      <w:proofErr w:type="gramEnd"/>
-      <w:r>
-        <w:rPr>
-          <w:rFonts w:ascii="Arial" w:hAnsi="Arial" w:cs="Arial"/>
-        </w:rPr>
-        <w:t xml:space="preserve"> algum relacionamento com a empresa e qual é esse relacionamento</w:t>
-      </w:r>
-    </w:p>
-    <w:p>
-      <w:pPr>
-        <w:pStyle w:val="PargrafodaLista"/>
-        <w:numPr>
-          <w:ilvl w:val="0"/>
-          <w:numId w:val="1"/>
-        </w:numPr>
-        <w:jc w:val="both"/>
-        <w:rPr>
-          <w:rFonts w:ascii="Arial" w:hAnsi="Arial" w:cs="Arial"/>
-        </w:rPr>
-      </w:pPr>
-      <w:bookmarkStart w:id="10" w:name="_Hlk200183669"/>
-      <w:r>
-        <w:rPr>
-          <w:rFonts w:ascii="Arial" w:hAnsi="Arial" w:cs="Arial"/>
-        </w:rPr>
-        <w:t>Liste o produto e a evolução de seu preço ao longo do tempo</w:t>
-      </w:r>
-      <w:bookmarkEnd w:id="10"/>
-    </w:p>
-    <w:p>
-      <w:pPr>
-        <w:pStyle w:val="PargrafodaLista"/>
-        <w:numPr>
-          <w:ilvl w:val="0"/>
-          <w:numId w:val="1"/>
-        </w:numPr>
-        <w:jc w:val="both"/>
-        <w:rPr>
-          <w:rFonts w:ascii="Arial" w:hAnsi="Arial" w:cs="Arial"/>
-        </w:rPr>
-      </w:pPr>
-      <w:r>
-        <w:rPr>
-          <w:rFonts w:ascii="Arial" w:hAnsi="Arial" w:cs="Arial"/>
-        </w:rPr>
-        <w:t>Q</w:t>
-      </w:r>
-      <w:r>
-        <w:rPr>
-          <w:rFonts w:ascii="Arial" w:hAnsi="Arial" w:cs="Arial"/>
-        </w:rPr>
-        <w:t>ual é o nome do vendedor que t</w:t>
-      </w:r>
-      <w:r>
-        <w:rPr>
-          <w:rFonts w:ascii="Arial" w:hAnsi="Arial" w:cs="Arial"/>
-        </w:rPr>
-        <w:t>ê</w:t>
-      </w:r>
-      <w:r>
-        <w:rPr>
-          <w:rFonts w:ascii="Arial" w:hAnsi="Arial" w:cs="Arial"/>
-        </w:rPr>
-        <w:t>m sua m</w:t>
-      </w:r>
-      <w:r>
-        <w:rPr>
-          <w:rFonts w:ascii="Arial" w:hAnsi="Arial" w:cs="Arial"/>
-        </w:rPr>
-        <w:t>é</w:t>
-      </w:r>
-      <w:r>
-        <w:rPr>
-          <w:rFonts w:ascii="Arial" w:hAnsi="Arial" w:cs="Arial"/>
-        </w:rPr>
-        <w:t xml:space="preserve">dia de vendas maior que </w:t>
-      </w:r>
-      <w:r>
-        <w:rPr>
-          <w:rFonts w:ascii="Arial" w:hAnsi="Arial" w:cs="Arial"/>
-        </w:rPr>
-        <w:t>média</w:t>
-      </w:r>
-      <w:r>
-        <w:rPr>
-          <w:rFonts w:ascii="Arial" w:hAnsi="Arial" w:cs="Arial"/>
-        </w:rPr>
-        <w:t xml:space="preserve"> dos demais vendedores</w:t>
-      </w:r>
-    </w:p>
-    <w:p>
-      <w:pPr>
-        <w:pStyle w:val="PargrafodaLista"/>
-        <w:numPr>
-          <w:ilvl w:val="0"/>
-          <w:numId w:val="1"/>
-        </w:numPr>
-        <w:jc w:val="both"/>
-        <w:rPr>
-          <w:rFonts w:ascii="Arial" w:hAnsi="Arial" w:cs="Arial"/>
-        </w:rPr>
-      </w:pPr>
-      <w:r>
-        <w:rPr>
-          <w:rFonts w:ascii="Arial" w:hAnsi="Arial" w:cs="Arial"/>
-        </w:rPr>
-        <w:t>Quem é o melhor vendedor em valor de vendas de cada d</w:t>
-      </w:r>
-      <w:r>
-        <w:rPr>
-          <w:rFonts w:ascii="Arial" w:hAnsi="Arial" w:cs="Arial"/>
-        </w:rPr>
-        <w:t>=c</w:t>
-      </w:r>
-      <w:r>
-        <w:rPr>
-          <w:rFonts w:ascii="Arial" w:hAnsi="Arial" w:cs="Arial"/>
-        </w:rPr>
-        <w:t>ategoria considerando os últimos 12 meses</w:t>
       </w:r>
     </w:p>
     <w:p>

</xml_diff>

<commit_message>
Lista e resposta final
</commit_message>
<xml_diff>
--- a/Lista/Pergutas/Lista 01.docx
+++ b/Lista/Pergutas/Lista 01.docx
@@ -730,25 +730,7 @@
         <w:rPr>
           <w:rFonts w:ascii="Arial" w:hAnsi="Arial" w:cs="Arial"/>
         </w:rPr>
-        <w:t xml:space="preserve">no </w:t>
-      </w:r>
-      <w:r>
-        <w:rPr>
-          <w:rFonts w:ascii="Arial" w:hAnsi="Arial" w:cs="Arial"/>
-        </w:rPr>
-        <w:t>país ‘</w:t>
-      </w:r>
-      <w:r>
-        <w:rPr>
-          <w:rFonts w:ascii="Arial" w:hAnsi="Arial" w:cs="Arial"/>
-        </w:rPr>
-        <w:t>B</w:t>
-      </w:r>
-      <w:r>
-        <w:rPr>
-          <w:rFonts w:ascii="Arial" w:hAnsi="Arial" w:cs="Arial"/>
-        </w:rPr>
-        <w:t>R</w:t>
+        <w:t>no país ‘BR</w:t>
       </w:r>
       <w:r>
         <w:rPr>
@@ -760,111 +742,81 @@
         <w:rPr>
           <w:rFonts w:ascii="Arial" w:hAnsi="Arial" w:cs="Arial"/>
         </w:rPr>
+        <w:t xml:space="preserve"> e </w:t>
+      </w:r>
+      <w:r>
+        <w:rPr>
+          <w:rFonts w:ascii="Arial" w:hAnsi="Arial" w:cs="Arial"/>
+        </w:rPr>
+        <w:t>nos estados de</w:t>
+      </w:r>
+      <w:r>
+        <w:rPr>
+          <w:rFonts w:ascii="Arial" w:hAnsi="Arial" w:cs="Arial"/>
+        </w:rPr>
+        <w:t>, '</w:t>
+      </w:r>
+      <w:r>
+        <w:rPr>
+          <w:rFonts w:ascii="Arial" w:hAnsi="Arial" w:cs="Arial"/>
+        </w:rPr>
+        <w:t>PE</w:t>
+      </w:r>
+      <w:proofErr w:type="gramStart"/>
+      <w:r>
+        <w:rPr>
+          <w:rFonts w:ascii="Arial" w:hAnsi="Arial" w:cs="Arial"/>
+        </w:rPr>
+        <w:t xml:space="preserve">' </w:t>
+      </w:r>
+      <w:r>
+        <w:rPr>
+          <w:rFonts w:ascii="Arial" w:hAnsi="Arial" w:cs="Arial"/>
+        </w:rPr>
+        <w:t>,</w:t>
+      </w:r>
+      <w:proofErr w:type="gramEnd"/>
+      <w:r>
+        <w:rPr>
+          <w:rFonts w:ascii="Arial" w:hAnsi="Arial" w:cs="Arial"/>
+        </w:rPr>
         <w:t xml:space="preserve"> </w:t>
       </w:r>
       <w:r>
         <w:rPr>
           <w:rFonts w:ascii="Arial" w:hAnsi="Arial" w:cs="Arial"/>
         </w:rPr>
+        <w:t>'</w:t>
+      </w:r>
+      <w:r>
+        <w:rPr>
+          <w:rFonts w:ascii="Arial" w:hAnsi="Arial" w:cs="Arial"/>
+        </w:rPr>
+        <w:t>AL</w:t>
+      </w:r>
+      <w:r>
+        <w:rPr>
+          <w:rFonts w:ascii="Arial" w:hAnsi="Arial" w:cs="Arial"/>
+        </w:rPr>
+        <w:t>'</w:t>
+      </w:r>
+      <w:r>
+        <w:rPr>
+          <w:rFonts w:ascii="Arial" w:hAnsi="Arial" w:cs="Arial"/>
+        </w:rPr>
+        <w:t xml:space="preserve"> </w:t>
+      </w:r>
+      <w:r>
+        <w:rPr>
+          <w:rFonts w:ascii="Arial" w:hAnsi="Arial" w:cs="Arial"/>
+        </w:rPr>
         <w:t xml:space="preserve">e </w:t>
       </w:r>
       <w:r>
         <w:rPr>
           <w:rFonts w:ascii="Arial" w:hAnsi="Arial" w:cs="Arial"/>
         </w:rPr>
-        <w:t>nos estados de</w:t>
-      </w:r>
-      <w:r>
-        <w:rPr>
-          <w:rFonts w:ascii="Arial" w:hAnsi="Arial" w:cs="Arial"/>
-        </w:rPr>
-        <w:t>, '</w:t>
-      </w:r>
-      <w:r>
-        <w:rPr>
-          <w:rFonts w:ascii="Arial" w:hAnsi="Arial" w:cs="Arial"/>
-        </w:rPr>
-        <w:t>P</w:t>
-      </w:r>
-      <w:r>
-        <w:rPr>
-          <w:rFonts w:ascii="Arial" w:hAnsi="Arial" w:cs="Arial"/>
-        </w:rPr>
-        <w:t>E</w:t>
-      </w:r>
-      <w:proofErr w:type="gramStart"/>
-      <w:r>
-        <w:rPr>
-          <w:rFonts w:ascii="Arial" w:hAnsi="Arial" w:cs="Arial"/>
-        </w:rPr>
-        <w:t xml:space="preserve">' </w:t>
-      </w:r>
-      <w:r>
-        <w:rPr>
-          <w:rFonts w:ascii="Arial" w:hAnsi="Arial" w:cs="Arial"/>
-        </w:rPr>
-        <w:t>,</w:t>
-      </w:r>
-      <w:proofErr w:type="gramEnd"/>
-      <w:r>
-        <w:rPr>
-          <w:rFonts w:ascii="Arial" w:hAnsi="Arial" w:cs="Arial"/>
-        </w:rPr>
-        <w:t xml:space="preserve"> </w:t>
-      </w:r>
-      <w:r>
-        <w:rPr>
-          <w:rFonts w:ascii="Arial" w:hAnsi="Arial" w:cs="Arial"/>
-        </w:rPr>
-        <w:t>'</w:t>
-      </w:r>
-      <w:r>
-        <w:rPr>
-          <w:rFonts w:ascii="Arial" w:hAnsi="Arial" w:cs="Arial"/>
-        </w:rPr>
-        <w:t>A</w:t>
-      </w:r>
-      <w:r>
-        <w:rPr>
-          <w:rFonts w:ascii="Arial" w:hAnsi="Arial" w:cs="Arial"/>
-        </w:rPr>
-        <w:t>L</w:t>
-      </w:r>
-      <w:r>
-        <w:rPr>
-          <w:rFonts w:ascii="Arial" w:hAnsi="Arial" w:cs="Arial"/>
-        </w:rPr>
-        <w:t>'</w:t>
-      </w:r>
-      <w:r>
-        <w:rPr>
-          <w:rFonts w:ascii="Arial" w:hAnsi="Arial" w:cs="Arial"/>
-        </w:rPr>
-        <w:t xml:space="preserve"> </w:t>
-      </w:r>
-      <w:r>
-        <w:rPr>
-          <w:rFonts w:ascii="Arial" w:hAnsi="Arial" w:cs="Arial"/>
-        </w:rPr>
-        <w:t xml:space="preserve">e </w:t>
-      </w:r>
-      <w:r>
-        <w:rPr>
-          <w:rFonts w:ascii="Arial" w:hAnsi="Arial" w:cs="Arial"/>
-        </w:rPr>
-        <w:t>‘B</w:t>
-      </w:r>
-      <w:r>
-        <w:rPr>
-          <w:rFonts w:ascii="Arial" w:hAnsi="Arial" w:cs="Arial"/>
-        </w:rPr>
-        <w:t>A</w:t>
-      </w:r>
-      <w:r>
-        <w:rPr>
-          <w:rFonts w:ascii="Arial" w:hAnsi="Arial" w:cs="Arial"/>
-        </w:rPr>
-        <w:t xml:space="preserve">’ </w:t>
+        <w:t xml:space="preserve">‘BA’ </w:t>
       </w:r>
       <w:r>
         <w:rPr>
@@ -1377,49 +1329,19 @@
         <w:rPr>
           <w:rFonts w:ascii="Arial" w:hAnsi="Arial" w:cs="Arial"/>
         </w:rPr>
-        <w:t>Q</w:t>
-      </w:r>
-      <w:r>
-        <w:rPr>
-          <w:rFonts w:ascii="Arial" w:hAnsi="Arial" w:cs="Arial"/>
-        </w:rPr>
-        <w:t>ual é o nome do vendedor que t</w:t>
-      </w:r>
-      <w:r>
-        <w:rPr>
-          <w:rFonts w:ascii="Arial" w:hAnsi="Arial" w:cs="Arial"/>
-        </w:rPr>
-        <w:t>ê</w:t>
-      </w:r>
-      <w:r>
-        <w:rPr>
-          <w:rFonts w:ascii="Arial" w:hAnsi="Arial" w:cs="Arial"/>
-        </w:rPr>
-        <w:t>m sua m</w:t>
-      </w:r>
-      <w:r>
-        <w:rPr>
-          <w:rFonts w:ascii="Arial" w:hAnsi="Arial" w:cs="Arial"/>
-        </w:rPr>
-        <w:t>é</w:t>
-      </w:r>
-      <w:r>
-        <w:rPr>
-          <w:rFonts w:ascii="Arial" w:hAnsi="Arial" w:cs="Arial"/>
-        </w:rPr>
-        <w:t xml:space="preserve">dia de vendas maior que </w:t>
-      </w:r>
-      <w:r>
-        <w:rPr>
-          <w:rFonts w:ascii="Arial" w:hAnsi="Arial" w:cs="Arial"/>
-        </w:rPr>
-        <w:t>média</w:t>
-      </w:r>
-      <w:r>
-        <w:rPr>
-          <w:rFonts w:ascii="Arial" w:hAnsi="Arial" w:cs="Arial"/>
-        </w:rPr>
-        <w:t xml:space="preserve"> dos demais vendedores</w:t>
+        <w:t xml:space="preserve">Quais são as 3 categorias de produtos que mais geraram receita bruta no último ano fiscal completo (de 1º de janeiro a 31 de dezembro de 2024), considerando apenas pedidos de clientes que nunca receberam um desconto superior a </w:t>
+      </w:r>
+      <w:r>
+        <w:rPr>
+          <w:rFonts w:ascii="Arial" w:hAnsi="Arial" w:cs="Arial"/>
+        </w:rPr>
+        <w:t>5</w:t>
+      </w:r>
+      <w:r>
+        <w:rPr>
+          <w:rFonts w:ascii="Arial" w:hAnsi="Arial" w:cs="Arial"/>
+        </w:rPr>
+        <w:t>% em nenhum de seus pedidos?</w:t>
       </w:r>
     </w:p>
     <w:p>
@@ -1465,6 +1387,7 @@
           <w:rFonts w:ascii="Arial" w:hAnsi="Arial" w:cs="Arial"/>
         </w:rPr>
       </w:pPr>
+      <w:bookmarkStart w:id="16" w:name="_Hlk202514412"/>
       <w:r>
         <w:rPr>
           <w:rFonts w:ascii="Arial" w:hAnsi="Arial" w:cs="Arial"/>
@@ -1519,6 +1442,7 @@
         </w:rPr>
         <w:t>'</w:t>
       </w:r>
+      <w:bookmarkEnd w:id="16"/>
     </w:p>
     <w:p>
       <w:pPr>
@@ -2797,7 +2721,6 @@
   <w:style w:type="character" w:default="1" w:styleId="Fontepargpadro">
     <w:name w:val="Default Paragraph Font"/>
     <w:uiPriority w:val="1"/>
-    <w:semiHidden/>
     <w:unhideWhenUsed/>
   </w:style>
   <w:style w:type="table" w:default="1" w:styleId="Tabelanormal">

</xml_diff>